<commit_message>
P1L6 reports: fix wording and typos in Semana 6 avance and defense guide
</commit_message>
<xml_diff>
--- a/reports/semana06.docx
+++ b/reports/semana06.docx
@@ -821,7 +821,7 @@
         <w:jc w:val="both"/>
       </w:pPr>
       <w:r>
-        <w:t>Esta rotación es una transformación orthogonal: su inversa es su matriz</w:t>
+        <w:t>Esta rotación es una transformación ortogonal: su inversa es su matriz</w:t>
       </w:r>
     </w:p>
     <w:p>
@@ -909,7 +909,7 @@
         <w:jc w:val="both"/>
       </w:pPr>
       <w:r>
-        <w:t>escala real, uso previsto en versiones posteriores.</w:t>
+        <w:t>escala reducida, uso previsto en versiones posteriores.</w:t>
       </w:r>
     </w:p>
     <w:p>
@@ -965,7 +965,7 @@
         <w:jc w:val="both"/>
       </w:pPr>
       <w:r>
-        <w:t>Para desarrollar sin depender de un teléfono seEstablished una pose de</w:t>
+        <w:t>Para desarrollar sin depender de un teléfono se estableció una pose de</w:t>
       </w:r>
     </w:p>
     <w:p>
@@ -1090,7 +1090,7 @@
         <w:jc w:val="both"/>
       </w:pPr>
       <w:r>
-        <w:t>error que tienen origen en el procesamiento de lasaude las que dependen del</w:t>
+        <w:t>error que tienen origen en el procesamiento de los datos y las que dependen del</w:t>
       </w:r>
     </w:p>
     <w:p>
@@ -1266,7 +1266,7 @@
         <w:jc w:val="both"/>
       </w:pPr>
       <w:r>
-        <w:t>cifra que se presentara como definitive antes de medir en terreno sería</w:t>
+        <w:t>cifra que se presentara como definitiva antes de medir en terreno sería</w:t>
       </w:r>
     </w:p>
     <w:p>
@@ -1290,7 +1290,7 @@
         <w:jc w:val="both"/>
       </w:pPr>
       <w:r>
-        <w:t>pose estimadapresentara un error angular de uno o dos grados respecto de la</w:t>
+        <w:t>pose estimada presentara un error angular de uno o dos grados respecto de la</w:t>
       </w:r>
     </w:p>
     <w:p>
@@ -1777,7 +1777,7 @@
         <w:jc w:val="both"/>
       </w:pPr>
       <w:r>
-        <w:t>corresponden a valores adoptados por criterio del analysta.</w:t>
+        <w:t>corresponden a valores adoptados por criterio del analista.</w:t>
       </w:r>
     </w:p>
     <w:p>
@@ -2297,7 +2297,7 @@
         <w:jc w:val="both"/>
       </w:pPr>
       <w:r>
-        <w:t>de 1e-15, lo que confirma que laumersión y el reparto de cargas conservan el</w:t>
+        <w:t>de 1e-15, lo que confirma que la imposición y el reparto de cargas conservan el</w:t>
       </w:r>
     </w:p>
     <w:p>
@@ -2353,7 +2353,7 @@
         <w:jc w:val="both"/>
       </w:pPr>
       <w:r>
-        <w:t>Las tres pruebas de capacidad merecen una precisión. Las curvas momento-curvatura</w:t>
+        <w:t>Las tres pruebas de capacidad merecen una aclaración. Las curvas momento-curvatura</w:t>
       </w:r>
     </w:p>
     <w:p>
@@ -2377,7 +2377,7 @@
         <w:jc w:val="both"/>
       </w:pPr>
       <w:r>
-        <w:t>constituyen una verificación normativa. SeذاPerfectamente posible que, al</w:t>
+        <w:t>constituyen una verificación normativa. Es perfectamente posible que, al</w:t>
       </w:r>
     </w:p>
     <w:p>
@@ -2393,7 +2393,7 @@
         <w:jc w:val="both"/>
       </w:pPr>
       <w:r>
-        <w:t>cambien los conteos señalados en la tabla. Aun así, se-publicó el estado</w:t>
+        <w:t>cambien los conteos señalados en la tabla. Aun así, se publicó el estado</w:t>
       </w:r>
     </w:p>
     <w:p>
@@ -2595,7 +2595,7 @@
         <w:jc w:val="both"/>
       </w:pPr>
       <w:r>
-        <w:t xml:space="preserve">  pobladas. La consulta de resultados utiliza la envolvente correcta,proveniente</w:t>
+        <w:t xml:space="preserve">  pobladas. La consulta de resultados utiliza la envolvente correcta, proveniente</w:t>
       </w:r>
     </w:p>
     <w:p>

</xml_diff>